<commit_message>
Update printable schedule for 2:30 session
</commit_message>
<xml_diff>
--- a/assets/2026-conference-schedule.docx
+++ b/assets/2026-conference-schedule.docx
@@ -1237,36 +1237,7 @@
           <w:b/>
           <w:bCs/>
         </w:rPr>
-        <w:t>Research 2: From IDLE to AI-mediated IDLE: A Systematic Literature Review of Empirical Research on Informal Digital Learning of English</w:t>
-      </w:r>
-    </w:p>
-    <w:p>
-      <w:r>
-        <w:rPr>
-          <w:i/>
-          <w:iCs/>
-        </w:rPr>
-        <w:t>Lily Tan, Ph.D. Student, Learning Design and Technology, Purdue University</w:t>
-      </w:r>
-    </w:p>
-    <w:p>
-      <w:r>
-        <w:t>AI Education Research | Grade Level: P-2; 3-5; 6-8; 9-12</w:t>
-      </w:r>
-    </w:p>
-    <w:p>
-      <w:r>
-        <w:t>Following PRISMA 2020, this review synthesized 214 studies of informal digital English learning. Evidence was concentrated in higher education, EFL settings, and East Asia, with limited research on school-age learners. The findings identify open questions about connecting students’ out-of-school AI-mediated language practices to classroom instruction.</w:t>
-      </w:r>
-    </w:p>
-    <w:p/>
-    <w:p>
-      <w:r>
-        <w:rPr>
-          <w:b/>
-          <w:bCs/>
-        </w:rPr>
-        <w:t>Research 3: The Design and Development of an AI-Native Real-Time Speaking Tutor Agent for 9-12 ESL Learners: A Design-Based Research Study</w:t>
+        <w:t>Research 2: The Design and Development of an AI-Native Real-Time Speaking Tutor Agent for 9-12 ESL Learners: A Design-Based Research Study</w:t>
       </w:r>
     </w:p>
     <w:p>
@@ -1860,6 +1831,35 @@
         <w:t>Students in grades 4–7 imagined LEGO® SPIKE™ programs and planned how to communicate their ideas to AI. The study examines program features, planned prompts, omitted information, and feasibility, positioning programming as a creative process and informing responsive AI-supported learning experiences.</w:t>
       </w:r>
     </w:p>
+    <w:p>
+      <w:r>
+        <w:rPr>
+          <w:b/>
+          <w:bCs/>
+        </w:rPr>
+        <w:t>Research 3: From IDLE to AI-mediated IDLE: A Systematic Literature Review of Empirical Research on Informal Digital Learning of English</w:t>
+      </w:r>
+    </w:p>
+    <w:p>
+      <w:r>
+        <w:rPr>
+          <w:i/>
+          <w:iCs/>
+        </w:rPr>
+        <w:t>Lily Tan, Ph.D. Student, Learning Design and Technology, Purdue University</w:t>
+      </w:r>
+    </w:p>
+    <w:p>
+      <w:r>
+        <w:t>AI Education Research | Grade Level: P-2; 3-5; 6-8; 9-12</w:t>
+      </w:r>
+    </w:p>
+    <w:p>
+      <w:r>
+        <w:t>Following PRISMA 2020, this review synthesized 214 studies of informal digital English learning. Evidence was concentrated in higher education, EFL settings, and East Asia, with limited research on school-age learners. The findings identify open questions about connecting students’ out-of-school AI-mediated language practices to classroom instruction.</w:t>
+      </w:r>
+    </w:p>
+    <w:p/>
     <w:p>
       <w:pPr>
         <w:rPr>

</xml_diff>

<commit_message>
Update printable schedule with presenter corrections
</commit_message>
<xml_diff>
--- a/assets/2026-conference-schedule.docx
+++ b/assets/2026-conference-schedule.docx
@@ -206,12 +206,12 @@
           <w:i/>
           <w:iCs/>
         </w:rPr>
-        <w:t>Bill Walker, Associate Director, Programs and Partnerships, CATALYST</w:t>
-      </w:r>
-    </w:p>
-    <w:p>
-      <w:r>
-        <w:t>AI Tools for Teachers &amp; Students | Grade Level: P-2; 3-5; 6-8; 9-12</w:t>
+        <w:t>Bill Walker, Associate Director, Programs and Partnerships, CATALYST; Paul Asunda, Associate Professor of Engineering and Technology Teacher Education and Executive Director of CATALYST</w:t>
+      </w:r>
+    </w:p>
+    <w:p>
+      <w:r>
+        <w:t>AI Tools for Teachers &amp; Students | Grade Level: 6-8; 9-12</w:t>
       </w:r>
     </w:p>
     <w:p>
@@ -282,7 +282,7 @@
           <w:i/>
           <w:iCs/>
         </w:rPr>
-        <w:t>Wayne Wright, Associate Dean, Purdue University</w:t>
+        <w:t>Wayne Wright, Associate Dean, Purdue University; Virak Chan</w:t>
       </w:r>
     </w:p>
     <w:p>
@@ -1063,7 +1063,7 @@
           <w:i/>
           <w:iCs/>
         </w:rPr>
-        <w:t>Susan Mcgrath, Solutions Architect and Implementation Specialist, LEGO® Education</w:t>
+        <w:t>Susan McGrath, Solutions Architect and Implementation Specialist, LEGO® Education</w:t>
       </w:r>
     </w:p>
     <w:p>
@@ -1073,7 +1073,7 @@
     </w:p>
     <w:p>
       <w:r>
-        <w:t>This interactive session uses LEGO® Education Computer Science and AI K–8 experiences to explore machine learning, data literacy, leadership, policy, and curriculum development. Participants will examine classroom examples and leave with resources and planning tools for sustainable AI implementation.</w:t>
+        <w:t>This interactive session explores how engaging LEGO® Education Computer Science and AI K–8 learning experiences can help build machine learning and data and AI literacy while informing the development of responsible AI policies and practices. Participants will examine classroom examples, explore essential AI and data competencies for students and educators, and discuss practical approaches to AI curriculum and policy development.</w:t>
       </w:r>
     </w:p>
     <w:p/>
@@ -1818,7 +1818,7 @@
           <w:i/>
           <w:iCs/>
         </w:rPr>
-        <w:t>Rachael Kenney, Associate Professor of Mathematics Education, Purdue University, College of Education, Department of Curriculum &amp; Instruction</w:t>
+        <w:t>Rachael Kenney, Associate Professor of Mathematics Education, Purdue University, College of Education, Department of Curriculum &amp; Instruction; Laura Bofferding; Asenath Odondi</w:t>
       </w:r>
     </w:p>
     <w:p>
@@ -1898,7 +1898,7 @@
           <w:i/>
           <w:iCs/>
         </w:rPr>
-        <w:t>Shanzay Qureshi, Purdue University</w:t>
+        <w:t>Shanzay Waqar Qureshi, Master’s Student in Learning Design and Technology, Purdue University</w:t>
       </w:r>
     </w:p>
     <w:p>
@@ -1956,12 +1956,12 @@
     </w:p>
     <w:p>
       <w:r>
-        <w:t>AI Tools for Teachers &amp; Students | Grade Level: 9-12</w:t>
-      </w:r>
-    </w:p>
-    <w:p>
-      <w:r>
-        <w:t>This workshop turns AI-literacy research into strategies for Grades 6–12. Participants examine traffic-light expectations, questioning and verification, AI-resistant assessment, reducing over-reliance, and recognizing possible AI-assisted work. Teachers leave with adaptable guidelines and classroom examples.</w:t>
+        <w:t>AI Literacy &amp; Teaching Strategies | Grade Level: 6-8; 9-12</w:t>
+      </w:r>
+    </w:p>
+    <w:p>
+      <w:r>
+        <w:t>This workshop translates AI-literacy research into practical classroom strategies for teachers working with students in Grades 6–12. Participants examine traffic-light expectations, questioning and verification, AI-resistant assessment, reducing over-reliance, and recognizing possible AI-assisted work. Teachers leave with adaptable guidelines and classroom examples.</w:t>
       </w:r>
     </w:p>
     <w:p/>

</xml_diff>